<commit_message>
feat(ml14): enable retraining and verify against the delivered code
</commit_message>
<xml_diff>
--- a/outputs/a14/a14_ficha_funcional.docx
+++ b/outputs/a14/a14_ficha_funcional.docx
@@ -578,7 +578,7 @@
           </w:tcPr>
           <w:p ns2:paraId="40956F30" ns2:textId="77777777">
             <w:r>
-              <w:t xml:space="preserve">Modo predict inline y predict batch (idéntico cálculo, solo cambia el transporte del histórico — JSON o CSV): se aporta un histórico semanal continuo (frecuencia domingo, sin huecos ni duplicados) de al menos 24 semanas con 6 variables base (índice de protección fitosanitaria, carburantes, cobre, gas, petróleo Brent, tipo de cambio EUR/USD); el servicio deriva automáticamente las 39 features (estacionalidad, retardos de 4/8/12 semanas, medias móviles de 4/8 semanas, diferencia mensual) y devuelve el precio predicho a 16 semanas, el precio actual y el baseline de drift de referencia. No hay modo de reentrenamiento por usuario (ver limitaciones): el procedimiento de entrenamiento entregado siempre reentrena sobre el mismo histórico bundled del equipo de IA, no acepta datos de cliente.</w:t>
+              <w:t xml:space="preserve">Modo predict inline y predict batch (idéntico cálculo, solo cambia el transporte del histórico — JSON o CSV): se aporta un histórico semanal continuo (frecuencia domingo, sin huecos ni duplicados) de al menos 24 semanas con 6 variables base (índice de protección fitosanitaria, carburantes, cobre, gas, petróleo Brent, tipo de cambio EUR/USD); el servicio deriva automáticamente las 39 features (estacionalidad, retardos de 4/8/12 semanas, medias móviles de 4/8 semanas, diferencia mensual) y devuelve el precio predicho a 16 semanas, el precio actual y el baseline de drift de referencia. También admite reentrenamiento por usuario (/train): con un histórico semanal propio repite el procedimiento del equipo de IA para la GRU y guarda el modelo resultante en MLflow, sin sustituir nunca el modelo base.</w:t>
             </w:r>
           </w:p>
         </w:tc>
@@ -1433,7 +1433,7 @@
     </w:p>
     <w:p ns2:paraId="36E72011" ns2:textId="77777777">
       <w:r>
-        <w:t xml:space="preserve">•  No permite reentrenamiento con datos propios del usuario — solo existe el artefacto fijo entregado por el equipo de IA.</w:t>
+        <w:t xml:space="preserve">•  No sustituye automáticamente el modelo base al reentrenar: el modelo reentrenado solo se usa si se indica su run de MLflow.</w:t>
       </w:r>
     </w:p>
     <w:p ns2:paraId="36E72011" ns2:textId="77777777">
@@ -1987,7 +1987,7 @@
           </w:tcPr>
           <w:p ns2:paraId="4308B354" ns2:textId="77777777">
             <w:r>
-              <w:t xml:space="preserve">Sin reentrenamiento por usuario</w:t>
+              <w:t xml:space="preserve">Reentrenamiento: requisitos y alcance</w:t>
             </w:r>
           </w:p>
         </w:tc>
@@ -2010,7 +2010,7 @@
           </w:tcPr>
           <w:p ns2:paraId="3FD46393" ns2:textId="77777777">
             <w:r>
-              <w:t xml:space="preserve">El procedimiento de entrenamiento entregado por el equipo de IA no acepta ningún dato de cliente: siempre reentrena sobre el mismo histórico fijo bundled, solo permite variar hiperparámetros. El endpoint /train de este servicio devuelve explícitamente 'no soportado' (HTTP 501) en vez de simular un reentrenamiento que no incorporaría datos nuevos.</w:t>
+              <w:t xml:space="preserve">El reentrenamiento por usuario repite el procedimiento del equipo de IA para la GRU (split temporal 80/20, 3 semillas, se guarda la de la semilla 42) con un histórico semanal en el formato del dataset de modelado o con las series en bruto. Como en el original, la parada temprana se decide sobre el propio periodo de test, así que sus métricas de test son optimistas. El modelo reentrenado solo se guarda en MLflow y se usa indicando su run; el modelo base no cambia.</w:t>
             </w:r>
           </w:p>
         </w:tc>

</xml_diff>